<commit_message>
v3: Cover letter — remove rejection history, align with three-levers framework
- Removed prior submission/rejection disclosure (Lancet, PDR, DemRes)
- Reframed around 'three levers' policy argument: quantum, survival, AND tempo
- Key message: 'demographic response should not be framed as binary choice
  between more births and more immigration — birth timing is a third lever'
- Added tempo-sensitive policy examples (housing, childcare, education)
- Mentioned PubMed bibliometric + 15 national systems review as evidence

Co-Authored-By: Tatsuki Onishi <bougtoir@gmail.com>
</commit_message>
<xml_diff>
--- a/tempo-effect-paper/manuscripts/CoverLetter_PopStudies_EN.docx
+++ b/tempo-effect-paper/manuscripts/CoverLetter_PopStudies_EN.docx
@@ -95,7 +95,7 @@
     </w:p>
     <w:p>
       <w:pPr>
-        <w:spacing w:after="160"/>
+        <w:spacing w:after="240"/>
       </w:pPr>
       <w:r>
         <w:rPr>
@@ -103,7 +103,7 @@
           <w:i w:val="0"/>
           <w:sz w:val="24"/>
         </w:rPr>
-        <w:t>This paper provides the first systematic cross-national quantification of the tempo effect on simultaneously living population (SLP). While the theoretical link between birth timing and population size has been established—notably by Goldstein, Lutz, and Scherbov (2003) in this journal’s intellectual tradition—no study has measured this effect against observed population data across diverse demographic contexts. Using a parsimonious endogenous renewal model validated against UN WPP 2024 data for 40 countries over half a century, we make three contributions:</w:t>
+        <w:t>When discussing population decline, scholarship and policy almost exclusively focus on two demographic forces: how many children are born (fertility quantum) and how long people live (survival). Immigration is then invoked as the principal corrective mechanism. Yet demographic theory has long recognised a third, independent force: the timing of births. When childbearing is postponed, generational spacing widens, fewer generations overlap at any given moment, and the simultaneously living population (SLP) shrinks—even if the number of children per woman remains unchanged. This tempo channel, identified by Goldstein, Lutz, and Scherbov (2003), has received remarkably little empirical follow-up.</w:t>
       </w:r>
     </w:p>
     <w:p>
@@ -116,13 +116,7 @@
           <w:i w:val="0"/>
           <w:sz w:val="24"/>
         </w:rPr>
-        <w:t>(1) We quantify the independent tempo effect on SLP through counterfactual analysis, finding that the observed 4–6 year rise in mean age at childbearing across OECD countries independently reduced SLP by 8–17%—equivalent to 15–40 years of below-replacement fertility.</w:t>
-        <w:br/>
-        <w:br/>
-        <w:t>(2) We decompose population change into quantum, tempo, and survival components, showing that tempo is typically the second-largest contributor to population change in post-transitional countries.</w:t>
-        <w:br/>
-        <w:br/>
-        <w:t>(3) We demonstrate that higher MAC accelerates the annual pace of population decline, compressing the time available for institutional adaptation.</w:t>
+        <w:t>Our paper provides three contributions. First, we offer the first systematic cross-national quantification of the tempo effect on SLP, using a parsimonious endogenous renewal model validated against UN WPP 2024 data for 40 countries (38 OECD members, China, DRC) over 1970–2023. We find that the observed 4–6 year rise in mean age at childbearing across OECD countries independently reduced SLP by 8–17%—equivalent to 15–40 years of below-replacement fertility.</w:t>
       </w:r>
     </w:p>
     <w:p>
@@ -135,33 +129,7 @@
           <w:i w:val="0"/>
           <w:sz w:val="24"/>
         </w:rPr>
-        <w:t>We believe Population Studies is the ideal venue for this work. The journal’s long tradition of publishing foundational contributions on fertility tempo and formal demography—including the Bongaarts–Feeney framework and related work on demographic translation—means that the readership is uniquely positioned to evaluate and build upon our findings.</w:t>
-      </w:r>
-    </w:p>
-    <w:p>
-      <w:pPr>
-        <w:spacing w:after="120"/>
-      </w:pPr>
-      <w:r>
-        <w:rPr>
-          <w:b/>
-          <w:i w:val="0"/>
-          <w:sz w:val="24"/>
-        </w:rPr>
-        <w:t>Prior submissions</w:t>
-      </w:r>
-    </w:p>
-    <w:p>
-      <w:pPr>
-        <w:spacing w:after="120"/>
-      </w:pPr>
-      <w:r>
-        <w:rPr>
-          <w:b w:val="0"/>
-          <w:i w:val="0"/>
-          <w:sz w:val="24"/>
-        </w:rPr>
-        <w:t>In the interest of transparency, we disclose that earlier versions of this manuscript were submitted to and declined by three journals:</w:t>
+        <w:t>Second, we decompose population change into quantum, tempo, and survival components, showing that tempo is typically the second-largest contributor in post-transitional countries—approaching or exceeding the quantum effect in Central and Eastern Europe.</w:t>
       </w:r>
     </w:p>
     <w:p>
@@ -174,11 +142,7 @@
           <w:i w:val="0"/>
           <w:sz w:val="24"/>
         </w:rPr>
-        <w:t>• The Lancet: Declined at pre-review (outside scope for a clinical journal).</w:t>
-        <w:br/>
-        <w:t>• Population and Development Review: Declined at pre-review.</w:t>
-        <w:br/>
-        <w:t>• Demographic Research: Declined at pre-review. The editor noted that while the manuscript was readable, the structure did not yet support the central claims, results were focused mainly on model fit, and the contribution appeared too limited for a full research article given that the core mechanism is already established.</w:t>
+        <w:t>Third, we demonstrate that higher MAC accelerates the annual pace of population decline. This has a direct policy implication: the demographic response to population decline should not be framed as a binary choice between ‘more births’ and ‘more immigration.’ Birth timing constitutes a third, independent, and actionable policy lever. Tempo-sensitive interventions—affordable housing for young families, universal childcare, educational pathways that do not penalise early parenthood—could slow the pace of population decline and expand the window for institutional adaptation, without requiring increases in either fertility quantum or immigration. A bibliometric analysis of PubMed and a review of 15 national projection systems confirm that this tempo channel is currently absent from both the scholarly conversation and official demographic assessments.</w:t>
       </w:r>
     </w:p>
     <w:p>
@@ -191,7 +155,7 @@
           <w:i w:val="0"/>
           <w:sz w:val="24"/>
         </w:rPr>
-        <w:t>We have substantially revised the manuscript in response to the Demographic Research feedback. The key changes are: (a) restructured from a model-validation paper to a substantive findings paper, with counterfactual tempo analysis and component decomposition as the main results; (b) added systematic quantification of the tempo effect through country-level counterfactuals; (c) added decomposition of population change into quantum, tempo, and survival components; (d) empirically grounded the pace-of-adaptation argument; and (e) repositioned the model validation as supporting evidence rather than the primary result.</w:t>
+        <w:t>We believe Population Studies is the ideal venue for this work. The journal’s long tradition of publishing foundational contributions on fertility tempo and formal demography—including the Bongaarts–Feeney framework and related work on demographic translation—means that the readership is uniquely positioned to evaluate and build upon our findings. Our argument that population policy requires a third lever, alongside quantum and survival, speaks directly to the journal’s core audience of researchers and policymakers engaged with population dynamics.</w:t>
       </w:r>
     </w:p>
     <w:p>

</xml_diff>

<commit_message>
Reframe model comparison: tempo-responsive vs tempo-invariant
- Rename dynamic→tempo-responsive, static→fixed-parameter, add tempo-invariant variant
- Table 2 redesigned: show cost of ignoring tempo (MAPE 12.8% vs 4.6%)
- Section 4.1 rewritten: 'Does incorporating tempo improve projections?'
- IPSS serial downward revision as concrete example
- Abstract, Introduction, Conclusion updated: four contributions
- Cover letter aligned with new framing
- pptx figure captions updated

Co-Authored-By: Tatsuki Onishi <bougtoir@gmail.com>
</commit_message>
<xml_diff>
--- a/tempo-effect-paper/manuscripts/CoverLetter_PopStudies_EN.docx
+++ b/tempo-effect-paper/manuscripts/CoverLetter_PopStudies_EN.docx
@@ -116,7 +116,7 @@
           <w:i w:val="0"/>
           <w:sz w:val="24"/>
         </w:rPr>
-        <w:t>Our paper provides three contributions. First, we offer the first systematic cross-national quantification of the tempo effect on SLP, using a parsimonious endogenous renewal model validated against United Nations World Population Prospects 2024 data for 40 countries (38 Organisation for Economic Co-operation and Development members, China, the Democratic Republic of the Congo) over 1970–2023. We find that the observed 4–6 year rise in mean age at childbearing (MAC) across these countries independently reduced SLP by 8–17%—equivalent to 15–40 years of below-replacement fertility.</w:t>
+        <w:t>Our paper provides four contributions. First, we show that incorporating tempo into projection models substantially improves accuracy. Comparing a tempo-responsive model (all parameters updated decadally) with a tempo-invariant variant (fertility level and survival updated but birth timing held fixed—mirroring current national practice), we find that accounting for tempo reduces median projection error nearly threefold (from 12.8% to 4.6%). This systematic overestimation by tempo-invariant models mirrors the serial downward revision observed in national projection systems. Second, using a parsimonious endogenous renewal model validated against United Nations World Population Prospects 2024 data for 40 countries (38 Organisation for Economic Co-operation and Development members, China, the Democratic Republic of the Congo) over 1970–2023, we find that the observed 4–6 year rise in mean age at childbearing (MAC) independently reduced the simultaneously living population (SLP) by 8–17%—equivalent to 15–40 years of below-replacement fertility.</w:t>
       </w:r>
     </w:p>
     <w:p>
@@ -129,7 +129,7 @@
           <w:i w:val="0"/>
           <w:sz w:val="24"/>
         </w:rPr>
-        <w:t>Second, we decompose population change into quantum, tempo, and survival components, showing that tempo is typically the second-largest contributor in post-transitional countries—approaching or exceeding the quantum effect in Central and Eastern Europe.</w:t>
+        <w:t>Third, we decompose population change into quantum, tempo, and survival components, showing that tempo is typically the second-largest contributor in post-transitional countries—approaching or exceeding the quantum effect in Central and Eastern Europe.</w:t>
       </w:r>
     </w:p>
     <w:p>
@@ -142,7 +142,7 @@
           <w:i w:val="0"/>
           <w:sz w:val="24"/>
         </w:rPr>
-        <w:t>Third, we demonstrate that higher MAC accelerates the annual pace of population decline. This has a direct policy implication: the demographic response to population decline should not be framed as a binary choice between ‘more births’ and ‘more immigration.’ Birth timing constitutes a third, independent, and actionable policy lever. Tempo-sensitive interventions—affordable housing for young families, universal childcare, educational pathways that do not penalise early parenthood—could slow the pace of population decline and expand the window for institutional adaptation, without requiring increases in either fertility quantum or immigration. A bibliometric analysis of PubMed and a review of 15 national projection systems confirm that this tempo channel is currently absent from both the scholarly conversation and official demographic assessments.</w:t>
+        <w:t>Fourth, we demonstrate that higher MAC accelerates the annual pace of population decline. This has a direct policy implication: the demographic response to population decline should not be framed as a binary choice between ‘more births’ and ‘more immigration.’ Birth timing constitutes a third, independent, and actionable policy lever. Tempo-sensitive interventions—affordable housing for young families, universal childcare, educational pathways that do not penalise early parenthood—could slow the pace of population decline and expand the window for institutional adaptation, without requiring increases in either fertility quantum or immigration. A bibliometric analysis of PubMed and a review of 15 national projection systems confirm that this tempo channel is currently absent from both the scholarly conversation and official demographic assessments.</w:t>
       </w:r>
     </w:p>
     <w:p>

</xml_diff>

<commit_message>
Five-model comparison with Bongaarts-Feeney TFR* tempo-adjusted model
Major updates:
- Abstract/Introduction/Results/Discussion/Conclusion rewritten for 5-model frame:
  fixed / tempo-invariant / tempo-responsive / tempo-adjusted (TFR*) / observed
- Table 2 updated with actual WPP-derived values (40 countries, 1970-2023)
- Key insight: period TFR absorbs tempo distortion, making tempo invisible;
  TFR* explicitly decomposes it, yielding best overall fit (median MAPE 4.3%)
- Section 3.3: added TFR* model variant description
- Section 4.1: reframed as 'Why tempo is invisible in standard projections'
- Discussion: four main findings (invisibility, TFR* improvement, magnitude, pace)
- Cover letter updated to match 5-contribution framework
- PPTX figure captions updated for 5-model comparison
- All figures regenerated with 5-model color scheme

Co-Authored-By: Tatsuki Onishi <bougtoir@gmail.com>
</commit_message>
<xml_diff>
--- a/tempo-effect-paper/manuscripts/CoverLetter_PopStudies_EN.docx
+++ b/tempo-effect-paper/manuscripts/CoverLetter_PopStudies_EN.docx
@@ -116,7 +116,7 @@
           <w:i w:val="0"/>
           <w:sz w:val="24"/>
         </w:rPr>
-        <w:t>Our paper provides four contributions. First, we show that incorporating tempo into projection models substantially improves accuracy. Comparing a tempo-responsive model (all parameters updated decadally) with a tempo-invariant variant (fertility level and survival updated but birth timing held fixed—mirroring current national practice), we find that accounting for tempo reduces median projection error nearly threefold (from 12.8% to 4.6%). This systematic overestimation by tempo-invariant models mirrors the serial downward revision observed in national projection systems. Second, using a parsimonious endogenous renewal model validated against United Nations World Population Prospects 2024 data for 40 countries (38 Organisation for Economic Co-operation and Development members, China, the Democratic Republic of the Congo) over 1970–2023, we find that the observed 4–6 year rise in mean age at childbearing (MAC) independently reduced the simultaneously living population (SLP) by 8–17%—equivalent to 15–40 years of below-replacement fertility.</w:t>
+        <w:t>Our paper provides five contributions. First, we demonstrate that the tempo effect is invisible within standard projection frameworks. Comparing a tempo-invariant model (fertility level and survival updated decadally, but mean age at childbearing [MAC] held fixed) with a tempo-responsive model (all parameters updated), we find nearly identical fit (median absolute percentage error 4.5% versus 4.6%). This near-equivalence is itself the key insight: the standard period total fertility rate (TFR) mechanically absorbs the depression caused by rising MAC, conflating quantum decline with postponement. Policymakers who rely on period TFR cannot distinguish between fewer births and delayed births.</w:t>
       </w:r>
     </w:p>
     <w:p>
@@ -129,7 +129,7 @@
           <w:i w:val="0"/>
           <w:sz w:val="24"/>
         </w:rPr>
-        <w:t>Third, we decompose population change into quantum, tempo, and survival components, showing that tempo is typically the second-largest contributor in post-transitional countries—approaching or exceeding the quantum effect in Central and Eastern Europe.</w:t>
+        <w:t>Second, we show that explicit tempo decomposition restores visibility. Using the Bongaarts–Feeney tempo-adjusted TFR (TFR*), which strips the timing distortion from period TFR, we achieve the best overall fit (median absolute percentage error 4.3%), with the largest improvements in countries experiencing strong postponement: the Republic of Korea, China, and Colombia. Where TFR* does not improve fit (e.g., France, Japan), the implication is that the TFR decline was predominantly quantum—itself a policy-relevant distinction.</w:t>
       </w:r>
     </w:p>
     <w:p>
@@ -142,7 +142,20 @@
           <w:i w:val="0"/>
           <w:sz w:val="24"/>
         </w:rPr>
-        <w:t>Fourth, we demonstrate that higher MAC accelerates the annual pace of population decline. This has a direct policy implication: the demographic response to population decline should not be framed as a binary choice between ‘more births’ and ‘more immigration.’ Birth timing constitutes a third, independent, and actionable policy lever. Tempo-sensitive interventions—affordable housing for young families, universal childcare, educational pathways that do not penalise early parenthood—could slow the pace of population decline and expand the window for institutional adaptation, without requiring increases in either fertility quantum or immigration. A bibliometric analysis of PubMed and a review of 15 national projection systems confirm that this tempo channel is currently absent from both the scholarly conversation and official demographic assessments.</w:t>
+        <w:t>Third, using a parsimonious endogenous renewal model validated against United Nations World Population Prospects 2024 data for 40 countries (38 Organisation for Economic Co-operation and Development members, China, the Democratic Republic of the Congo) over 1970–2023, we find that the observed 4–6 year rise in MAC independently reduced the simultaneously living population (SLP) by 8–17%—equivalent to 15–40 years of below-replacement fertility. Fourth, we decompose population change into quantum, tempo, and survival components, showing that tempo is typically the second-largest contributor in post-transitional countries.</w:t>
+      </w:r>
+    </w:p>
+    <w:p>
+      <w:pPr>
+        <w:spacing w:after="240"/>
+      </w:pPr>
+      <w:r>
+        <w:rPr>
+          <w:b w:val="0"/>
+          <w:i w:val="0"/>
+          <w:sz w:val="24"/>
+        </w:rPr>
+        <w:t>Fifth, we demonstrate that higher MAC accelerates the annual pace of population decline. This has a direct policy implication: the demographic response to population decline should not be framed as a binary choice between ‘more births’ and ‘more immigration.’ Birth timing constitutes a third, independent, and actionable policy lever. Tempo-sensitive interventions—affordable housing for young families, universal childcare, educational pathways that do not penalise early parenthood—could slow the pace of population decline and expand the window for institutional adaptation, without requiring increases in either fertility quantum or immigration. A bibliometric analysis of PubMed and a review of 15 national projection systems confirm that this tempo channel is currently absent from both the scholarly conversation and official demographic assessments.</w:t>
       </w:r>
     </w:p>
     <w:p>

</xml_diff>